<commit_message>
Final formatting: Times New Roman 12pt, fields 1.5cm, single spacing
</commit_message>
<xml_diff>
--- a/bank/task_01/variant_01.docx
+++ b/bank/task_01/variant_01.docx
@@ -3,16 +3,10 @@
 <w:document xmlns:wpc="http://schemas.microsoft.com/office/word/2010/wordprocessingCanvas" xmlns:cx="http://schemas.microsoft.com/office/drawing/2014/chartex" xmlns:cx1="http://schemas.microsoft.com/office/drawing/2015/9/8/chartex" xmlns:cx2="http://schemas.microsoft.com/office/drawing/2015/10/21/chartex" xmlns:cx3="http://schemas.microsoft.com/office/drawing/2016/5/9/chartex" xmlns:cx4="http://schemas.microsoft.com/office/drawing/2016/5/10/chartex" xmlns:cx5="http://schemas.microsoft.com/office/drawing/2016/5/11/chartex" xmlns:cx6="http://schemas.microsoft.com/office/drawing/2016/5/12/chartex" xmlns:cx7="http://schemas.microsoft.com/office/drawing/2016/5/13/chartex" xmlns:cx8="http://schemas.microsoft.com/office/drawing/2016/5/14/chartex" xmlns:mc="http://schemas.openxmlformats.org/markup-compatibility/2006" xmlns:aink="http://schemas.microsoft.com/office/drawing/2016/ink" xmlns:am3d="http://schemas.microsoft.com/office/drawing/2017/model3d" xmlns:o="urn:schemas-microsoft-com:office:office" xmlns:r="http://schemas.openxmlformats.org/officeDocument/2006/relationships" xmlns:m="http://schemas.openxmlformats.org/officeDocument/2006/math" xmlns:v="urn:schemas-microsoft-com:vml" xmlns:wp14="http://schemas.microsoft.com/office/word/2010/wordprocessingDrawing" xmlns:wp="http://schemas.openxmlformats.org/drawingml/2006/wordprocessingDrawing" xmlns:w10="urn:schemas-microsoft-com:office:word" xmlns:w="http://schemas.openxmlformats.org/wordprocessingml/2006/main" xmlns:w14="http://schemas.microsoft.com/office/word/2010/wordml" xmlns:w15="http://schemas.microsoft.com/office/word/2012/wordml" xmlns:w16cex="http://schemas.microsoft.com/office/word/2018/wordml/cex" xmlns:w16cid="http://schemas.microsoft.com/office/word/2016/wordml/cid" xmlns:w16="http://schemas.microsoft.com/office/word/2018/wordml" xmlns:w16sdtdh="http://schemas.microsoft.com/office/word/2020/wordml/sdtdatahash" xmlns:w16se="http://schemas.microsoft.com/office/word/2015/wordml/symex" xmlns:wpg="http://schemas.microsoft.com/office/word/2010/wordprocessingGroup" xmlns:wpi="http://schemas.microsoft.com/office/word/2010/wordprocessingInk" xmlns:wne="http://schemas.microsoft.com/office/word/2006/wordml" xmlns:wps="http://schemas.microsoft.com/office/word/2010/wordprocessingShape" mc:Ignorable="w14 w15 w16se w16cid w16 w16cex w16sdtdh wp14">
   <w:body>
     <w:p>
-      <w:pPr>
-        <w:rPr>
-          <w:sz w:val="24"/>
-        </w:rPr>
-      </w:pPr>
       <w:r>
         <w:rPr>
-          <w:rFonts w:ascii="Cambria Math" w:eastAsia="Times New Roman" w:hAnsi="Cambria Math" w:cs="Segoe UI"/>
+          <w:rFonts w:eastAsia="Times New Roman"/>
           <w:bCs/>
-          <w:sz w:val="24"/>
           <w:szCs w:val="28"/>
           <w:lang w:eastAsia="ru-RU"/>
         </w:rPr>
@@ -20,8 +14,7 @@
       </w:r>
       <w:r>
         <w:rPr>
-          <w:rFonts w:ascii="Cambria Math" w:eastAsia="Times New Roman" w:hAnsi="Cambria Math" w:cs="Segoe UI"/>
-          <w:sz w:val="24"/>
+          <w:rFonts w:eastAsia="Times New Roman"/>
           <w:szCs w:val="28"/>
           <w:lang w:eastAsia="ru-RU"/>
         </w:rPr>
@@ -30,31 +23,19 @@
       <m:oMath>
         <m:r>
           <w:rPr>
-            <w:rFonts w:ascii="Cambria Math" w:eastAsia="Times New Roman" w:hAnsi="Cambria Math" w:cs="Times New Roman"/>
-            <w:sz w:val="24"/>
+            <w:rFonts w:ascii="Cambria Math" w:eastAsia="Times New Roman" w:hAnsi="Cambria Math"/>
             <w:szCs w:val="28"/>
             <w:bdr w:val="none" w:sz="0" w:space="0" w:color="auto" w:frame="1"/>
             <w:lang w:eastAsia="ru-RU"/>
           </w:rPr>
-          <m:t>14</m:t>
-        </m:r>
-        <m:r>
-          <w:rPr>
-            <w:rFonts w:ascii="Cambria Math" w:eastAsia="Times New Roman" w:hAnsi="Cambria Math" w:cs="Cambria Math"/>
-            <w:sz w:val="24"/>
-            <w:szCs w:val="28"/>
-            <w:bdr w:val="none" w:sz="0" w:space="0" w:color="auto" w:frame="1"/>
-            <w:lang w:eastAsia="ru-RU"/>
-          </w:rPr>
-          <m:t>⋅</m:t>
+          <m:t>14⋅</m:t>
         </m:r>
         <m:sSup>
           <m:sSupPr>
             <m:ctrlPr>
               <w:rPr>
-                <w:rFonts w:ascii="Cambria Math" w:eastAsia="Times New Roman" w:hAnsi="Cambria Math" w:cs="Times New Roman"/>
+                <w:rFonts w:ascii="Cambria Math" w:eastAsia="Times New Roman" w:hAnsi="Cambria Math"/>
                 <w:i/>
-                <w:sz w:val="24"/>
                 <w:szCs w:val="28"/>
                 <w:bdr w:val="none" w:sz="0" w:space="0" w:color="auto" w:frame="1"/>
                 <w:lang w:val="en-US" w:eastAsia="ru-RU"/>
@@ -66,9 +47,8 @@
               <m:dPr>
                 <m:ctrlPr>
                   <w:rPr>
-                    <w:rFonts w:ascii="Cambria Math" w:eastAsia="Times New Roman" w:hAnsi="Cambria Math" w:cs="Times New Roman"/>
+                    <w:rFonts w:ascii="Cambria Math" w:eastAsia="Times New Roman" w:hAnsi="Cambria Math"/>
                     <w:i/>
-                    <w:sz w:val="24"/>
                     <w:szCs w:val="28"/>
                     <w:bdr w:val="none" w:sz="0" w:space="0" w:color="auto" w:frame="1"/>
                     <w:lang w:eastAsia="ru-RU"/>
@@ -80,9 +60,8 @@
                   <m:fPr>
                     <m:ctrlPr>
                       <w:rPr>
-                        <w:rFonts w:ascii="Cambria Math" w:eastAsia="Times New Roman" w:hAnsi="Cambria Math" w:cs="Times New Roman"/>
+                        <w:rFonts w:ascii="Cambria Math" w:eastAsia="Times New Roman" w:hAnsi="Cambria Math"/>
                         <w:i/>
-                        <w:sz w:val="24"/>
                         <w:szCs w:val="28"/>
                         <w:bdr w:val="none" w:sz="0" w:space="0" w:color="auto" w:frame="1"/>
                         <w:lang w:eastAsia="ru-RU"/>
@@ -92,8 +71,7 @@
                   <m:num>
                     <m:r>
                       <w:rPr>
-                        <w:rFonts w:ascii="Cambria Math" w:eastAsia="Times New Roman" w:hAnsi="Cambria Math" w:cs="Times New Roman"/>
-                        <w:sz w:val="24"/>
+                        <w:rFonts w:ascii="Cambria Math" w:eastAsia="Times New Roman" w:hAnsi="Cambria Math"/>
                         <w:szCs w:val="28"/>
                         <w:bdr w:val="none" w:sz="0" w:space="0" w:color="auto" w:frame="1"/>
                         <w:lang w:eastAsia="ru-RU"/>
@@ -104,8 +82,7 @@
                   <m:den>
                     <m:r>
                       <w:rPr>
-                        <w:rFonts w:ascii="Cambria Math" w:eastAsia="Times New Roman" w:hAnsi="Cambria Math" w:cs="Times New Roman"/>
-                        <w:sz w:val="24"/>
+                        <w:rFonts w:ascii="Cambria Math" w:eastAsia="Times New Roman" w:hAnsi="Cambria Math"/>
                         <w:szCs w:val="28"/>
                         <w:bdr w:val="none" w:sz="0" w:space="0" w:color="auto" w:frame="1"/>
                         <w:lang w:eastAsia="ru-RU"/>
@@ -118,9 +95,8 @@
             </m:d>
             <m:ctrlPr>
               <w:rPr>
-                <w:rFonts w:ascii="Cambria Math" w:eastAsia="Times New Roman" w:hAnsi="Cambria Math" w:cs="Cambria Math"/>
+                <w:rFonts w:ascii="Cambria Math" w:eastAsia="Times New Roman" w:hAnsi="Cambria Math"/>
                 <w:i/>
-                <w:sz w:val="24"/>
                 <w:szCs w:val="28"/>
                 <w:bdr w:val="none" w:sz="0" w:space="0" w:color="auto" w:frame="1"/>
                 <w:lang w:eastAsia="ru-RU"/>
@@ -130,8 +106,7 @@
           <m:sup>
             <m:r>
               <w:rPr>
-                <w:rFonts w:ascii="Cambria Math" w:eastAsia="Times New Roman" w:hAnsi="Cambria Math" w:cs="Times New Roman"/>
-                <w:sz w:val="24"/>
+                <w:rFonts w:ascii="Cambria Math" w:eastAsia="Times New Roman" w:hAnsi="Cambria Math"/>
                 <w:szCs w:val="28"/>
                 <w:bdr w:val="none" w:sz="0" w:space="0" w:color="auto" w:frame="1"/>
                 <w:lang w:eastAsia="ru-RU"/>
@@ -142,31 +117,19 @@
         </m:sSup>
         <m:r>
           <w:rPr>
-            <w:rFonts w:ascii="Cambria Math" w:eastAsia="Times New Roman" w:hAnsi="Cambria Math" w:cs="Times New Roman"/>
-            <w:sz w:val="24"/>
+            <w:rFonts w:ascii="Cambria Math" w:eastAsia="Times New Roman" w:hAnsi="Cambria Math"/>
             <w:szCs w:val="28"/>
             <w:bdr w:val="none" w:sz="0" w:space="0" w:color="auto" w:frame="1"/>
             <w:lang w:eastAsia="ru-RU"/>
           </w:rPr>
-          <m:t>-23</m:t>
-        </m:r>
-        <m:r>
-          <w:rPr>
-            <w:rFonts w:ascii="Cambria Math" w:eastAsia="Times New Roman" w:hAnsi="Cambria Math" w:cs="Cambria Math"/>
-            <w:sz w:val="24"/>
-            <w:szCs w:val="28"/>
-            <w:bdr w:val="none" w:sz="0" w:space="0" w:color="auto" w:frame="1"/>
-            <w:lang w:eastAsia="ru-RU"/>
-          </w:rPr>
-          <m:t>⋅</m:t>
+          <m:t>-23⋅</m:t>
         </m:r>
         <m:f>
           <m:fPr>
             <m:ctrlPr>
               <w:rPr>
-                <w:rFonts w:ascii="Cambria Math" w:eastAsia="Times New Roman" w:hAnsi="Cambria Math" w:cs="Times New Roman"/>
+                <w:rFonts w:ascii="Cambria Math" w:eastAsia="Times New Roman" w:hAnsi="Cambria Math"/>
                 <w:i/>
-                <w:sz w:val="24"/>
                 <w:szCs w:val="28"/>
                 <w:bdr w:val="none" w:sz="0" w:space="0" w:color="auto" w:frame="1"/>
                 <w:lang w:eastAsia="ru-RU"/>
@@ -176,30 +139,18 @@
           <m:num>
             <m:r>
               <w:rPr>
-                <w:rFonts w:ascii="Cambria Math" w:eastAsia="Times New Roman" w:hAnsi="Cambria Math" w:cs="Times New Roman"/>
-                <w:sz w:val="24"/>
+                <w:rFonts w:ascii="Cambria Math" w:eastAsia="Times New Roman" w:hAnsi="Cambria Math"/>
                 <w:szCs w:val="28"/>
                 <w:bdr w:val="none" w:sz="0" w:space="0" w:color="auto" w:frame="1"/>
                 <w:lang w:eastAsia="ru-RU"/>
               </w:rPr>
               <m:t>1</m:t>
             </m:r>
-            <m:ctrlPr>
-              <w:rPr>
-                <w:rFonts w:ascii="Cambria Math" w:eastAsia="Times New Roman" w:hAnsi="Cambria Math" w:cs="Cambria Math"/>
-                <w:i/>
-                <w:sz w:val="24"/>
-                <w:szCs w:val="28"/>
-                <w:bdr w:val="none" w:sz="0" w:space="0" w:color="auto" w:frame="1"/>
-                <w:lang w:eastAsia="ru-RU"/>
-              </w:rPr>
-            </m:ctrlPr>
           </m:num>
           <m:den>
             <m:r>
               <w:rPr>
-                <w:rFonts w:ascii="Cambria Math" w:eastAsia="Times New Roman" w:hAnsi="Cambria Math" w:cs="Times New Roman"/>
-                <w:sz w:val="24"/>
+                <w:rFonts w:ascii="Cambria Math" w:eastAsia="Times New Roman" w:hAnsi="Cambria Math"/>
                 <w:szCs w:val="28"/>
                 <w:bdr w:val="none" w:sz="0" w:space="0" w:color="auto" w:frame="1"/>
                 <w:lang w:eastAsia="ru-RU"/>
@@ -210,27 +161,17 @@
         </m:f>
         <m:r>
           <w:rPr>
-            <w:rFonts w:ascii="Cambria Math" w:eastAsia="Times New Roman" w:hAnsi="Cambria Math" w:cs="Times New Roman"/>
-            <w:sz w:val="24"/>
+            <w:rFonts w:ascii="Cambria Math" w:eastAsia="Times New Roman" w:hAnsi="Cambria Math"/>
             <w:szCs w:val="28"/>
             <w:lang w:eastAsia="ru-RU"/>
           </w:rPr>
-          <m:t>​​</m:t>
-        </m:r>
-        <m:r>
-          <w:rPr>
-            <w:rFonts w:ascii="Cambria Math" w:eastAsia="Times New Roman" w:hAnsi="Cambria Math" w:cs="Segoe UI"/>
-            <w:sz w:val="24"/>
-            <w:szCs w:val="28"/>
-            <w:lang w:eastAsia="ru-RU"/>
-          </w:rPr>
-          <m:t> </m:t>
+          <m:t>​​ </m:t>
         </m:r>
       </m:oMath>
     </w:p>
     <w:sectPr>
       <w:pgSz w:w="11906" w:h="16838"/>
-      <w:pgMar w:top="1134" w:right="850" w:bottom="1134" w:left="1701" w:header="708" w:footer="708" w:gutter="0"/>
+      <w:pgMar w:top="850" w:right="850" w:bottom="850" w:left="850" w:header="708" w:footer="708" w:gutter="0"/>
       <w:cols w:space="708"/>
       <w:docGrid w:linePitch="360"/>
     </w:sectPr>
@@ -636,6 +577,14 @@
   <w:style w:type="paragraph" w:default="1" w:styleId="a">
     <w:name w:val="Normal"/>
     <w:qFormat/>
+    <w:pPr>
+      <w:spacing w:after="0" w:line="240" w:lineRule="auto"/>
+      <w:jc w:val="both"/>
+    </w:pPr>
+    <w:rPr>
+      <w:rFonts w:ascii="Times New Roman" w:hAnsi="Times New Roman" w:cs="Times New Roman"/>
+      <w:sz w:val="24"/>
+    </w:rPr>
   </w:style>
   <w:style w:type="character" w:default="1" w:styleId="a0">
     <w:name w:val="Default Paragraph Font"/>

</xml_diff>